<commit_message>
feat: rebuild C27 with connected maintenance Copilot labs
</commit_message>
<xml_diff>
--- a/courseware/LP-Microsoft 365 Copilot Masterclass.docx
+++ b/courseware/LP-Microsoft 365 Copilot Masterclass.docx
@@ -123,7 +123,7 @@
           <w:color w:val="111827"/>
           <w:sz w:val="24"/>
         </w:rPr>
-        <w:t>Course Code: C027</w:t>
+        <w:t>Course Code: C27</w:t>
       </w:r>
     </w:p>
     <w:p>
@@ -179,7 +179,7 @@
           <w:color w:val="1F6FEB"/>
           <w:sz w:val="24"/>
         </w:rPr>
-        <w:t>Version 1.0</w:t>
+        <w:t>Version 2.0</w:t>
       </w:r>
     </w:p>
     <w:p>
@@ -205,18 +205,19 @@
         <w:tblStyle w:val="TableGrid"/>
         <w:tblW w:type="auto" w:w="0"/>
         <w:jc w:val="center"/>
+        <w:tblLayout w:type="fixed"/>
         <w:tblLook w:firstColumn="1" w:firstRow="1" w:lastColumn="0" w:lastRow="0" w:noHBand="0" w:noVBand="1" w:val="04A0"/>
       </w:tblPr>
       <w:tblGrid>
-        <w:gridCol w:w="2160"/>
-        <w:gridCol w:w="2160"/>
-        <w:gridCol w:w="2160"/>
-        <w:gridCol w:w="2160"/>
+        <w:gridCol w:w="1152"/>
+        <w:gridCol w:w="1656"/>
+        <w:gridCol w:w="4896"/>
+        <w:gridCol w:w="1656"/>
       </w:tblGrid>
       <w:tr>
         <w:tc>
           <w:tcPr>
-            <w:tcW w:type="dxa" w:w="2160"/>
+            <w:tcW w:type="dxa" w:w="1152"/>
             <w:shd w:val="clear" w:color="auto" w:fill="1F6FEB"/>
           </w:tcPr>
           <w:p>
@@ -233,7 +234,7 @@
         </w:tc>
         <w:tc>
           <w:tcPr>
-            <w:tcW w:type="dxa" w:w="2160"/>
+            <w:tcW w:type="dxa" w:w="1656"/>
             <w:shd w:val="clear" w:color="auto" w:fill="1F6FEB"/>
           </w:tcPr>
           <w:p>
@@ -250,7 +251,7 @@
         </w:tc>
         <w:tc>
           <w:tcPr>
-            <w:tcW w:type="dxa" w:w="2160"/>
+            <w:tcW w:type="dxa" w:w="4896"/>
             <w:shd w:val="clear" w:color="auto" w:fill="1F6FEB"/>
           </w:tcPr>
           <w:p>
@@ -267,7 +268,7 @@
         </w:tc>
         <w:tc>
           <w:tcPr>
-            <w:tcW w:type="dxa" w:w="2160"/>
+            <w:tcW w:type="dxa" w:w="1656"/>
             <w:shd w:val="clear" w:color="auto" w:fill="1F6FEB"/>
           </w:tcPr>
           <w:p>
@@ -286,7 +287,7 @@
       <w:tr>
         <w:tc>
           <w:tcPr>
-            <w:tcW w:type="dxa" w:w="2160"/>
+            <w:tcW w:type="dxa" w:w="1152"/>
           </w:tcPr>
           <w:p>
             <w:r/>
@@ -300,7 +301,7 @@
         </w:tc>
         <w:tc>
           <w:tcPr>
-            <w:tcW w:type="dxa" w:w="2160"/>
+            <w:tcW w:type="dxa" w:w="1656"/>
           </w:tcPr>
           <w:p>
             <w:r/>
@@ -308,13 +309,13 @@
               <w:rPr>
                 <w:sz w:val="19"/>
               </w:rPr>
-              <w:t>29 July 2026</w:t>
+              <w:t>30 September 2026</w:t>
             </w:r>
           </w:p>
         </w:tc>
         <w:tc>
           <w:tcPr>
-            <w:tcW w:type="dxa" w:w="2160"/>
+            <w:tcW w:type="dxa" w:w="4896"/>
           </w:tcPr>
           <w:p>
             <w:r/>
@@ -322,13 +323,13 @@
               <w:rPr>
                 <w:sz w:val="19"/>
               </w:rPr>
-              <w:t>Initial aligned release of PPT, Learner Guide, Lesson Plan and eight connected labs.</w:t>
+              <w:t>Previous Asteron cross-app scenario; retained in archive.</w:t>
             </w:r>
           </w:p>
         </w:tc>
         <w:tc>
           <w:tcPr>
-            <w:tcW w:type="dxa" w:w="2160"/>
+            <w:tcW w:type="dxa" w:w="1656"/>
           </w:tcPr>
           <w:p>
             <w:r/>
@@ -336,7 +337,65 @@
               <w:rPr>
                 <w:sz w:val="19"/>
               </w:rPr>
-              <w:t>Assigned Tertiary Infotech Academy Trainer</w:t>
+              <w:t>Tertiary Infotech Academy</w:t>
+            </w:r>
+          </w:p>
+        </w:tc>
+      </w:tr>
+      <w:tr>
+        <w:tc>
+          <w:tcPr>
+            <w:tcW w:type="dxa" w:w="1152"/>
+          </w:tcPr>
+          <w:p>
+            <w:r/>
+            <w:r>
+              <w:rPr>
+                <w:sz w:val="19"/>
+              </w:rPr>
+              <w:t>2.0</w:t>
+            </w:r>
+          </w:p>
+        </w:tc>
+        <w:tc>
+          <w:tcPr>
+            <w:tcW w:type="dxa" w:w="1656"/>
+          </w:tcPr>
+          <w:p>
+            <w:r/>
+            <w:r>
+              <w:rPr>
+                <w:sz w:val="19"/>
+              </w:rPr>
+              <w:t>13 October 2026</w:t>
+            </w:r>
+          </w:p>
+        </w:tc>
+        <w:tc>
+          <w:tcPr>
+            <w:tcW w:type="dxa" w:w="4896"/>
+          </w:tcPr>
+          <w:p>
+            <w:r/>
+            <w:r>
+              <w:rPr>
+                <w:sz w:val="19"/>
+              </w:rPr>
+              <w:t>Four maintenance topics; eight connected labs, custom Excel/PowerPoint skills, interactive dashboard and management presentation; C34 design.</w:t>
+            </w:r>
+          </w:p>
+        </w:tc>
+        <w:tc>
+          <w:tcPr>
+            <w:tcW w:type="dxa" w:w="1656"/>
+          </w:tcPr>
+          <w:p>
+            <w:r/>
+            <w:r>
+              <w:rPr>
+                <w:sz w:val="19"/>
+              </w:rPr>
+              <w:t>Tertiary Infotech Academy</w:t>
             </w:r>
           </w:p>
         </w:tc>
@@ -451,7 +510,7 @@
           <w:color w:val="333333"/>
           <w:sz w:val="21"/>
         </w:rPr>
-        <w:t>Day 1 — Ground, create, analyse, coordinate and govern one connected Microsoft 365 Copilot workflow</w:t>
+        <w:t>Day 1 — Maintenance workflow, custom skills, interactive dashboard and professional management presentation</w:t>
         <w:tab/>
         <w:t>4</w:t>
       </w:r>
@@ -493,11 +552,12 @@
       <w:tblPr>
         <w:tblStyle w:val="TableGrid"/>
         <w:tblW w:type="auto" w:w="0"/>
+        <w:tblLayout w:type="fixed"/>
         <w:tblLook w:firstColumn="1" w:firstRow="1" w:lastColumn="0" w:lastRow="0" w:noHBand="0" w:noVBand="1" w:val="04A0"/>
       </w:tblPr>
       <w:tblGrid>
-        <w:gridCol w:w="4320"/>
-        <w:gridCol w:w="4320"/>
+        <w:gridCol w:w="2448"/>
+        <w:gridCol w:w="6912"/>
       </w:tblGrid>
       <w:tr>
         <w:trPr>
@@ -505,7 +565,7 @@
         </w:trPr>
         <w:tc>
           <w:tcPr>
-            <w:tcW w:type="dxa" w:w="4320"/>
+            <w:tcW w:type="dxa" w:w="2448"/>
             <w:shd w:val="clear" w:color="auto" w:fill="E8F0FE"/>
           </w:tcPr>
           <w:p>
@@ -521,7 +581,7 @@
         </w:tc>
         <w:tc>
           <w:tcPr>
-            <w:tcW w:type="dxa" w:w="4320"/>
+            <w:tcW w:type="dxa" w:w="6912"/>
           </w:tcPr>
           <w:p>
             <w:r/>
@@ -540,7 +600,7 @@
         </w:trPr>
         <w:tc>
           <w:tcPr>
-            <w:tcW w:type="dxa" w:w="4320"/>
+            <w:tcW w:type="dxa" w:w="2448"/>
             <w:shd w:val="clear" w:color="auto" w:fill="E8F0FE"/>
           </w:tcPr>
           <w:p>
@@ -556,7 +616,7 @@
         </w:tc>
         <w:tc>
           <w:tcPr>
-            <w:tcW w:type="dxa" w:w="4320"/>
+            <w:tcW w:type="dxa" w:w="6912"/>
           </w:tcPr>
           <w:p>
             <w:r/>
@@ -564,7 +624,7 @@
               <w:rPr>
                 <w:sz w:val="20"/>
               </w:rPr>
-              <w:t>C027</w:t>
+              <w:t>C27</w:t>
             </w:r>
           </w:p>
         </w:tc>
@@ -575,7 +635,7 @@
         </w:trPr>
         <w:tc>
           <w:tcPr>
-            <w:tcW w:type="dxa" w:w="4320"/>
+            <w:tcW w:type="dxa" w:w="2448"/>
             <w:shd w:val="clear" w:color="auto" w:fill="E8F0FE"/>
           </w:tcPr>
           <w:p>
@@ -591,7 +651,7 @@
         </w:tc>
         <w:tc>
           <w:tcPr>
-            <w:tcW w:type="dxa" w:w="4320"/>
+            <w:tcW w:type="dxa" w:w="6912"/>
           </w:tcPr>
           <w:p>
             <w:r/>
@@ -610,7 +670,7 @@
         </w:trPr>
         <w:tc>
           <w:tcPr>
-            <w:tcW w:type="dxa" w:w="4320"/>
+            <w:tcW w:type="dxa" w:w="2448"/>
             <w:shd w:val="clear" w:color="auto" w:fill="E8F0FE"/>
           </w:tcPr>
           <w:p>
@@ -626,7 +686,7 @@
         </w:tc>
         <w:tc>
           <w:tcPr>
-            <w:tcW w:type="dxa" w:w="4320"/>
+            <w:tcW w:type="dxa" w:w="6912"/>
           </w:tcPr>
           <w:p>
             <w:r/>
@@ -645,7 +705,7 @@
         </w:trPr>
         <w:tc>
           <w:tcPr>
-            <w:tcW w:type="dxa" w:w="4320"/>
+            <w:tcW w:type="dxa" w:w="2448"/>
             <w:shd w:val="clear" w:color="auto" w:fill="E8F0FE"/>
           </w:tcPr>
           <w:p>
@@ -661,7 +721,7 @@
         </w:tc>
         <w:tc>
           <w:tcPr>
-            <w:tcW w:type="dxa" w:w="4320"/>
+            <w:tcW w:type="dxa" w:w="6912"/>
           </w:tcPr>
           <w:p>
             <w:r/>
@@ -680,7 +740,7 @@
         </w:trPr>
         <w:tc>
           <w:tcPr>
-            <w:tcW w:type="dxa" w:w="4320"/>
+            <w:tcW w:type="dxa" w:w="2448"/>
             <w:shd w:val="clear" w:color="auto" w:fill="E8F0FE"/>
           </w:tcPr>
           <w:p>
@@ -696,7 +756,7 @@
         </w:tc>
         <w:tc>
           <w:tcPr>
-            <w:tcW w:type="dxa" w:w="4320"/>
+            <w:tcW w:type="dxa" w:w="6912"/>
           </w:tcPr>
           <w:p>
             <w:r/>
@@ -704,7 +764,7 @@
               <w:rPr>
                 <w:sz w:val="20"/>
               </w:rPr>
-              <w:t>Instructor-led masterclass with connected hands-on labs</w:t>
+              <w:t>Instructor-led, hands-on practical labs</w:t>
             </w:r>
           </w:p>
         </w:tc>
@@ -715,7 +775,7 @@
         </w:trPr>
         <w:tc>
           <w:tcPr>
-            <w:tcW w:type="dxa" w:w="4320"/>
+            <w:tcW w:type="dxa" w:w="2448"/>
             <w:shd w:val="clear" w:color="auto" w:fill="E8F0FE"/>
           </w:tcPr>
           <w:p>
@@ -731,7 +791,7 @@
         </w:tc>
         <w:tc>
           <w:tcPr>
-            <w:tcW w:type="dxa" w:w="4320"/>
+            <w:tcW w:type="dxa" w:w="6912"/>
           </w:tcPr>
           <w:p>
             <w:r/>
@@ -767,7 +827,7 @@
         <w:rPr>
           <w:sz w:val="21"/>
         </w:rPr>
-        <w:t>LO1: Explain how Microsoft 365 Copilot grounds responses, apply a structured prompt method and verify a source-backed research summary in Copilot Chat.</w:t>
+        <w:t>LO1: Integrate Word, Excel, PowerPoint and Outlook Copilot in a coherent maintenance workflow with explicit source grounding and verified prompts.</w:t>
       </w:r>
     </w:p>
     <w:p>
@@ -778,7 +838,7 @@
         <w:rPr>
           <w:sz w:val="21"/>
         </w:rPr>
-        <w:t>LO2: Draft, rewrite and validate a business document in Word, then generate and refine a presentation in PowerPoint from the approved document.</w:t>
+        <w:t>LO2: Create, install, apply and improve a custom maintenance-reporting skill in Excel and PowerPoint, preserving source records and testing reruns.</w:t>
       </w:r>
     </w:p>
     <w:p>
@@ -789,7 +849,7 @@
         <w:rPr>
           <w:sz w:val="21"/>
         </w:rPr>
-        <w:t>LO3: Analyse a bounded dataset and generate formulas in Excel, then summarise a synthetic email thread and prepare a reviewed response in Outlook.</w:t>
+        <w:t>LO3: Create an interactive maintenance dashboard with verified measures, common filter scope, meaningful charts and a demonstrated refresh test.</w:t>
       </w:r>
     </w:p>
     <w:p>
@@ -800,7 +860,7 @@
         <w:rPr>
           <w:sz w:val="21"/>
         </w:rPr>
-        <w:t>LO4: Produce a Teams meeting recap and action register, connect outputs across Microsoft 365 apps, and apply responsible-use, privacy and human-review controls.</w:t>
+        <w:t>LO4: Continue from the dashboard to a professional management presentation, with evidence-based headlines, source notes, rehearsal and a reviewed handoff draft.</w:t>
       </w:r>
     </w:p>
     <w:p>
@@ -871,7 +931,7 @@
         <w:keepNext/>
       </w:pPr>
       <w:r>
-        <w:t>Day 1 — Ground, create, analyse, coordinate and govern one connected Microsoft 365 Copilot workflow</w:t>
+        <w:t>Day 1 — Maintenance workflow, custom skills, interactive dashboard and professional management presentation</w:t>
       </w:r>
     </w:p>
     <w:tbl>
@@ -879,12 +939,13 @@
         <w:tblStyle w:val="TableGrid"/>
         <w:tblW w:type="auto" w:w="0"/>
         <w:jc w:val="center"/>
+        <w:tblLayout w:type="fixed"/>
         <w:tblLook w:firstColumn="1" w:firstRow="1" w:lastColumn="0" w:lastRow="0" w:noHBand="0" w:noVBand="1" w:val="04A0"/>
       </w:tblPr>
       <w:tblGrid>
-        <w:gridCol w:w="2880"/>
-        <w:gridCol w:w="2880"/>
-        <w:gridCol w:w="2880"/>
+        <w:gridCol w:w="1584"/>
+        <w:gridCol w:w="1224"/>
+        <w:gridCol w:w="6552"/>
       </w:tblGrid>
       <w:tr>
         <w:trPr>
@@ -893,7 +954,7 @@
         </w:trPr>
         <w:tc>
           <w:tcPr>
-            <w:tcW w:type="dxa" w:w="1656"/>
+            <w:tcW w:type="dxa" w:w="1584"/>
             <w:shd w:val="clear" w:color="auto" w:fill="1F6FEB"/>
           </w:tcPr>
           <w:p>
@@ -911,7 +972,7 @@
         </w:tc>
         <w:tc>
           <w:tcPr>
-            <w:tcW w:type="dxa" w:w="1296"/>
+            <w:tcW w:type="dxa" w:w="1224"/>
             <w:shd w:val="clear" w:color="auto" w:fill="1F6FEB"/>
           </w:tcPr>
           <w:p>
@@ -929,7 +990,7 @@
         </w:tc>
         <w:tc>
           <w:tcPr>
-            <w:tcW w:type="dxa" w:w="6840"/>
+            <w:tcW w:type="dxa" w:w="6552"/>
             <w:shd w:val="clear" w:color="auto" w:fill="1F6FEB"/>
           </w:tcPr>
           <w:p>
@@ -952,7 +1013,7 @@
         </w:trPr>
         <w:tc>
           <w:tcPr>
-            <w:tcW w:type="dxa" w:w="1656"/>
+            <w:tcW w:type="dxa" w:w="1584"/>
             <w:shd w:val="clear" w:color="auto" w:fill="F3F5F8"/>
           </w:tcPr>
           <w:p>
@@ -963,13 +1024,13 @@
                 <w:b w:val="0"/>
                 <w:sz w:val="19"/>
               </w:rPr>
-              <w:t>9:30–9:50</w:t>
+              <w:t>09:30–09:45</w:t>
             </w:r>
           </w:p>
         </w:tc>
         <w:tc>
           <w:tcPr>
-            <w:tcW w:type="dxa" w:w="1296"/>
+            <w:tcW w:type="dxa" w:w="1224"/>
             <w:shd w:val="clear" w:color="auto" w:fill="F3F5F8"/>
           </w:tcPr>
           <w:p>
@@ -980,13 +1041,13 @@
                 <w:b w:val="0"/>
                 <w:sz w:val="19"/>
               </w:rPr>
-              <w:t>20 min</w:t>
+              <w:t>15 min</w:t>
             </w:r>
           </w:p>
         </w:tc>
         <w:tc>
           <w:tcPr>
-            <w:tcW w:type="dxa" w:w="6840"/>
+            <w:tcW w:type="dxa" w:w="6552"/>
             <w:shd w:val="clear" w:color="auto" w:fill="F3F5F8"/>
           </w:tcPr>
           <w:p>
@@ -997,7 +1058,7 @@
                 <w:b w:val="0"/>
                 <w:sz w:val="19"/>
               </w:rPr>
-              <w:t>Welcome, learning outcomes, setup and Copilot availability check</w:t>
+              <w:t>Welcome, learning outcomes, app access and Northstar scenario</w:t>
             </w:r>
           </w:p>
         </w:tc>
@@ -1008,7 +1069,7 @@
         </w:trPr>
         <w:tc>
           <w:tcPr>
-            <w:tcW w:type="dxa" w:w="1656"/>
+            <w:tcW w:type="dxa" w:w="1584"/>
             <w:shd w:val="clear" w:color="auto" w:fill="E8F0FE"/>
           </w:tcPr>
           <w:p>
@@ -1019,13 +1080,13 @@
                 <w:b/>
                 <w:sz w:val="19"/>
               </w:rPr>
-              <w:t>9:50–10:45</w:t>
+              <w:t>09:45–09:55</w:t>
             </w:r>
           </w:p>
         </w:tc>
         <w:tc>
           <w:tcPr>
-            <w:tcW w:type="dxa" w:w="1296"/>
+            <w:tcW w:type="dxa" w:w="1224"/>
             <w:shd w:val="clear" w:color="auto" w:fill="E8F0FE"/>
           </w:tcPr>
           <w:p>
@@ -1036,13 +1097,13 @@
                 <w:b w:val="0"/>
                 <w:sz w:val="19"/>
               </w:rPr>
-              <w:t>55 min</w:t>
+              <w:t>10 min</w:t>
             </w:r>
           </w:p>
         </w:tc>
         <w:tc>
           <w:tcPr>
-            <w:tcW w:type="dxa" w:w="6840"/>
+            <w:tcW w:type="dxa" w:w="6552"/>
             <w:shd w:val="clear" w:color="auto" w:fill="E8F0FE"/>
           </w:tcPr>
           <w:p>
@@ -1053,7 +1114,7 @@
                 <w:b/>
                 <w:sz w:val="19"/>
               </w:rPr>
-              <w:t>Topic 1 - Copilot architecture, G-C-S-E prompting, Chat, Word and PowerPoint concepts with demonstrations</w:t>
+              <w:t>Topic 1: concepts for Lab 1</w:t>
             </w:r>
           </w:p>
         </w:tc>
@@ -1064,7 +1125,7 @@
         </w:trPr>
         <w:tc>
           <w:tcPr>
-            <w:tcW w:type="dxa" w:w="1656"/>
+            <w:tcW w:type="dxa" w:w="1584"/>
           </w:tcPr>
           <w:p>
             <w:r/>
@@ -1074,13 +1135,13 @@
                 <w:b w:val="0"/>
                 <w:sz w:val="19"/>
               </w:rPr>
-              <w:t>10:45–11:20</w:t>
+              <w:t>09:55–10:30</w:t>
             </w:r>
           </w:p>
         </w:tc>
         <w:tc>
           <w:tcPr>
-            <w:tcW w:type="dxa" w:w="1296"/>
+            <w:tcW w:type="dxa" w:w="1224"/>
           </w:tcPr>
           <w:p>
             <w:r/>
@@ -1096,7 +1157,7 @@
         </w:tc>
         <w:tc>
           <w:tcPr>
-            <w:tcW w:type="dxa" w:w="6840"/>
+            <w:tcW w:type="dxa" w:w="6552"/>
           </w:tcPr>
           <w:p>
             <w:r/>
@@ -1106,7 +1167,7 @@
                 <w:b w:val="0"/>
                 <w:sz w:val="19"/>
               </w:rPr>
-              <w:t>Hands-on: Lab 1: Research the Asteron Launch and Build a Verified Source Register</w:t>
+              <w:t>Lab 1 (Excel to Word): Prepare Work Orders and Draft the Operations Brief</w:t>
             </w:r>
           </w:p>
         </w:tc>
@@ -1117,7 +1178,7 @@
         </w:trPr>
         <w:tc>
           <w:tcPr>
-            <w:tcW w:type="dxa" w:w="1656"/>
+            <w:tcW w:type="dxa" w:w="1584"/>
             <w:shd w:val="clear" w:color="auto" w:fill="FFF4E5"/>
           </w:tcPr>
           <w:p>
@@ -1128,13 +1189,13 @@
                 <w:b w:val="0"/>
                 <w:sz w:val="19"/>
               </w:rPr>
-              <w:t>11:20–11:35</w:t>
+              <w:t>10:30–10:45</w:t>
             </w:r>
           </w:p>
         </w:tc>
         <w:tc>
           <w:tcPr>
-            <w:tcW w:type="dxa" w:w="1296"/>
+            <w:tcW w:type="dxa" w:w="1224"/>
             <w:shd w:val="clear" w:color="auto" w:fill="FFF4E5"/>
           </w:tcPr>
           <w:p>
@@ -1151,7 +1212,7 @@
         </w:tc>
         <w:tc>
           <w:tcPr>
-            <w:tcW w:type="dxa" w:w="6840"/>
+            <w:tcW w:type="dxa" w:w="6552"/>
             <w:shd w:val="clear" w:color="auto" w:fill="FFF4E5"/>
           </w:tcPr>
           <w:p>
@@ -1173,7 +1234,25 @@
         </w:trPr>
         <w:tc>
           <w:tcPr>
-            <w:tcW w:type="dxa" w:w="1656"/>
+            <w:tcW w:type="dxa" w:w="1584"/>
+            <w:shd w:val="clear" w:color="auto" w:fill="E8F0FE"/>
+          </w:tcPr>
+          <w:p>
+            <w:r/>
+            <w:r>
+              <w:rPr>
+                <w:rFonts w:ascii="Arial" w:hAnsi="Arial"/>
+                <w:b/>
+                <w:sz w:val="19"/>
+              </w:rPr>
+              <w:t>10:45–10:55</w:t>
+            </w:r>
+          </w:p>
+        </w:tc>
+        <w:tc>
+          <w:tcPr>
+            <w:tcW w:type="dxa" w:w="1224"/>
+            <w:shd w:val="clear" w:color="auto" w:fill="E8F0FE"/>
           </w:tcPr>
           <w:p>
             <w:r/>
@@ -1183,13 +1262,160 @@
                 <w:b w:val="0"/>
                 <w:sz w:val="19"/>
               </w:rPr>
-              <w:t>11:35–12:15</w:t>
+              <w:t>10 min</w:t>
             </w:r>
           </w:p>
         </w:tc>
         <w:tc>
           <w:tcPr>
-            <w:tcW w:type="dxa" w:w="1296"/>
+            <w:tcW w:type="dxa" w:w="6552"/>
+            <w:shd w:val="clear" w:color="auto" w:fill="E8F0FE"/>
+          </w:tcPr>
+          <w:p>
+            <w:r/>
+            <w:r>
+              <w:rPr>
+                <w:rFonts w:ascii="Arial" w:hAnsi="Arial"/>
+                <w:b/>
+                <w:sz w:val="19"/>
+              </w:rPr>
+              <w:t>Topic 1: concepts for Lab 2</w:t>
+            </w:r>
+          </w:p>
+        </w:tc>
+      </w:tr>
+      <w:tr>
+        <w:trPr>
+          <w:cantSplit/>
+        </w:trPr>
+        <w:tc>
+          <w:tcPr>
+            <w:tcW w:type="dxa" w:w="1584"/>
+          </w:tcPr>
+          <w:p>
+            <w:r/>
+            <w:r>
+              <w:rPr>
+                <w:rFonts w:ascii="Arial" w:hAnsi="Arial"/>
+                <w:b w:val="0"/>
+                <w:sz w:val="19"/>
+              </w:rPr>
+              <w:t>10:55–11:30</w:t>
+            </w:r>
+          </w:p>
+        </w:tc>
+        <w:tc>
+          <w:tcPr>
+            <w:tcW w:type="dxa" w:w="1224"/>
+          </w:tcPr>
+          <w:p>
+            <w:r/>
+            <w:r>
+              <w:rPr>
+                <w:rFonts w:ascii="Arial" w:hAnsi="Arial"/>
+                <w:b w:val="0"/>
+                <w:sz w:val="19"/>
+              </w:rPr>
+              <w:t>35 min</w:t>
+            </w:r>
+          </w:p>
+        </w:tc>
+        <w:tc>
+          <w:tcPr>
+            <w:tcW w:type="dxa" w:w="6552"/>
+          </w:tcPr>
+          <w:p>
+            <w:r/>
+            <w:r>
+              <w:rPr>
+                <w:rFonts w:ascii="Arial" w:hAnsi="Arial"/>
+                <w:b w:val="0"/>
+                <w:sz w:val="19"/>
+              </w:rPr>
+              <w:t>Lab 2 (Word to PowerPoint and Outlook): Create the Cross-App Maintenance Update</w:t>
+            </w:r>
+          </w:p>
+        </w:tc>
+      </w:tr>
+      <w:tr>
+        <w:trPr>
+          <w:cantSplit/>
+        </w:trPr>
+        <w:tc>
+          <w:tcPr>
+            <w:tcW w:type="dxa" w:w="1584"/>
+            <w:shd w:val="clear" w:color="auto" w:fill="E8F0FE"/>
+          </w:tcPr>
+          <w:p>
+            <w:r/>
+            <w:r>
+              <w:rPr>
+                <w:rFonts w:ascii="Arial" w:hAnsi="Arial"/>
+                <w:b/>
+                <w:sz w:val="19"/>
+              </w:rPr>
+              <w:t>11:30–11:40</w:t>
+            </w:r>
+          </w:p>
+        </w:tc>
+        <w:tc>
+          <w:tcPr>
+            <w:tcW w:type="dxa" w:w="1224"/>
+            <w:shd w:val="clear" w:color="auto" w:fill="E8F0FE"/>
+          </w:tcPr>
+          <w:p>
+            <w:r/>
+            <w:r>
+              <w:rPr>
+                <w:rFonts w:ascii="Arial" w:hAnsi="Arial"/>
+                <w:b w:val="0"/>
+                <w:sz w:val="19"/>
+              </w:rPr>
+              <w:t>10 min</w:t>
+            </w:r>
+          </w:p>
+        </w:tc>
+        <w:tc>
+          <w:tcPr>
+            <w:tcW w:type="dxa" w:w="6552"/>
+            <w:shd w:val="clear" w:color="auto" w:fill="E8F0FE"/>
+          </w:tcPr>
+          <w:p>
+            <w:r/>
+            <w:r>
+              <w:rPr>
+                <w:rFonts w:ascii="Arial" w:hAnsi="Arial"/>
+                <w:b/>
+                <w:sz w:val="19"/>
+              </w:rPr>
+              <w:t>Topic 2: concepts for Lab 3</w:t>
+            </w:r>
+          </w:p>
+        </w:tc>
+      </w:tr>
+      <w:tr>
+        <w:trPr>
+          <w:cantSplit/>
+        </w:trPr>
+        <w:tc>
+          <w:tcPr>
+            <w:tcW w:type="dxa" w:w="1584"/>
+          </w:tcPr>
+          <w:p>
+            <w:r/>
+            <w:r>
+              <w:rPr>
+                <w:rFonts w:ascii="Arial" w:hAnsi="Arial"/>
+                <w:b w:val="0"/>
+                <w:sz w:val="19"/>
+              </w:rPr>
+              <w:t>11:40–12:20</w:t>
+            </w:r>
+          </w:p>
+        </w:tc>
+        <w:tc>
+          <w:tcPr>
+            <w:tcW w:type="dxa" w:w="1224"/>
           </w:tcPr>
           <w:p>
             <w:r/>
@@ -1205,7 +1431,7 @@
         </w:tc>
         <w:tc>
           <w:tcPr>
-            <w:tcW w:type="dxa" w:w="6840"/>
+            <w:tcW w:type="dxa" w:w="6552"/>
           </w:tcPr>
           <w:p>
             <w:r/>
@@ -1215,7 +1441,7 @@
                 <w:b w:val="0"/>
                 <w:sz w:val="19"/>
               </w:rPr>
-              <w:t>Hands-on: Lab 2: Draft and Approve the Asteron Launch Brief in Word</w:t>
+              <w:t>Lab 3 (Author SKILL.md): Create a Custom Maintenance Reporting Skill</w:t>
             </w:r>
           </w:p>
         </w:tc>
@@ -1226,60 +1452,7 @@
         </w:trPr>
         <w:tc>
           <w:tcPr>
-            <w:tcW w:type="dxa" w:w="1656"/>
-          </w:tcPr>
-          <w:p>
-            <w:r/>
-            <w:r>
-              <w:rPr>
-                <w:rFonts w:ascii="Arial" w:hAnsi="Arial"/>
-                <w:b w:val="0"/>
-                <w:sz w:val="19"/>
-              </w:rPr>
-              <w:t>12:15–12:55</w:t>
-            </w:r>
-          </w:p>
-        </w:tc>
-        <w:tc>
-          <w:tcPr>
-            <w:tcW w:type="dxa" w:w="1296"/>
-          </w:tcPr>
-          <w:p>
-            <w:r/>
-            <w:r>
-              <w:rPr>
-                <w:rFonts w:ascii="Arial" w:hAnsi="Arial"/>
-                <w:b w:val="0"/>
-                <w:sz w:val="19"/>
-              </w:rPr>
-              <w:t>40 min</w:t>
-            </w:r>
-          </w:p>
-        </w:tc>
-        <w:tc>
-          <w:tcPr>
-            <w:tcW w:type="dxa" w:w="6840"/>
-          </w:tcPr>
-          <w:p>
-            <w:r/>
-            <w:r>
-              <w:rPr>
-                <w:rFonts w:ascii="Arial" w:hAnsi="Arial"/>
-                <w:b w:val="0"/>
-                <w:sz w:val="19"/>
-              </w:rPr>
-              <w:t>Hands-on: Lab 3: Generate and Refine the Asteron Decision Deck in PowerPoint</w:t>
-            </w:r>
-          </w:p>
-        </w:tc>
-      </w:tr>
-      <w:tr>
-        <w:trPr>
-          <w:cantSplit/>
-        </w:trPr>
-        <w:tc>
-          <w:tcPr>
-            <w:tcW w:type="dxa" w:w="1656"/>
+            <w:tcW w:type="dxa" w:w="1584"/>
             <w:shd w:val="clear" w:color="auto" w:fill="FDE9D9"/>
           </w:tcPr>
           <w:p>
@@ -1290,13 +1463,13 @@
                 <w:b w:val="0"/>
                 <w:sz w:val="19"/>
               </w:rPr>
-              <w:t>12:55–13:55</w:t>
+              <w:t>12:20–13:20</w:t>
             </w:r>
           </w:p>
         </w:tc>
         <w:tc>
           <w:tcPr>
-            <w:tcW w:type="dxa" w:w="1296"/>
+            <w:tcW w:type="dxa" w:w="1224"/>
             <w:shd w:val="clear" w:color="auto" w:fill="FDE9D9"/>
           </w:tcPr>
           <w:p>
@@ -1313,7 +1486,7 @@
         </w:tc>
         <w:tc>
           <w:tcPr>
-            <w:tcW w:type="dxa" w:w="6840"/>
+            <w:tcW w:type="dxa" w:w="6552"/>
             <w:shd w:val="clear" w:color="auto" w:fill="FDE9D9"/>
           </w:tcPr>
           <w:p>
@@ -1324,7 +1497,7 @@
                 <w:b w:val="0"/>
                 <w:sz w:val="19"/>
               </w:rPr>
-              <w:t>Lunch break</w:t>
+              <w:t>Lunch</w:t>
             </w:r>
           </w:p>
         </w:tc>
@@ -1335,7 +1508,7 @@
         </w:trPr>
         <w:tc>
           <w:tcPr>
-            <w:tcW w:type="dxa" w:w="1656"/>
+            <w:tcW w:type="dxa" w:w="1584"/>
             <w:shd w:val="clear" w:color="auto" w:fill="E8F0FE"/>
           </w:tcPr>
           <w:p>
@@ -1346,13 +1519,13 @@
                 <w:b/>
                 <w:sz w:val="19"/>
               </w:rPr>
-              <w:t>13:55–14:40</w:t>
+              <w:t>13:20–13:30</w:t>
             </w:r>
           </w:p>
         </w:tc>
         <w:tc>
           <w:tcPr>
-            <w:tcW w:type="dxa" w:w="1296"/>
+            <w:tcW w:type="dxa" w:w="1224"/>
             <w:shd w:val="clear" w:color="auto" w:fill="E8F0FE"/>
           </w:tcPr>
           <w:p>
@@ -1363,13 +1536,13 @@
                 <w:b w:val="0"/>
                 <w:sz w:val="19"/>
               </w:rPr>
-              <w:t>45 min</w:t>
+              <w:t>10 min</w:t>
             </w:r>
           </w:p>
         </w:tc>
         <w:tc>
           <w:tcPr>
-            <w:tcW w:type="dxa" w:w="6840"/>
+            <w:tcW w:type="dxa" w:w="6552"/>
             <w:shd w:val="clear" w:color="auto" w:fill="E8F0FE"/>
           </w:tcPr>
           <w:p>
@@ -1380,7 +1553,7 @@
                 <w:b/>
                 <w:sz w:val="19"/>
               </w:rPr>
-              <w:t>Topic 2 - Excel, Outlook, Teams, cross-app handoffs, responsible use and data privacy</w:t>
+              <w:t>Topic 2: concepts for Lab 4</w:t>
             </w:r>
           </w:p>
         </w:tc>
@@ -1391,7 +1564,7 @@
         </w:trPr>
         <w:tc>
           <w:tcPr>
-            <w:tcW w:type="dxa" w:w="1656"/>
+            <w:tcW w:type="dxa" w:w="1584"/>
           </w:tcPr>
           <w:p>
             <w:r/>
@@ -1401,13 +1574,13 @@
                 <w:b w:val="0"/>
                 <w:sz w:val="19"/>
               </w:rPr>
-              <w:t>14:40–15:25</w:t>
+              <w:t>13:30–14:10</w:t>
             </w:r>
           </w:p>
         </w:tc>
         <w:tc>
           <w:tcPr>
-            <w:tcW w:type="dxa" w:w="1296"/>
+            <w:tcW w:type="dxa" w:w="1224"/>
           </w:tcPr>
           <w:p>
             <w:r/>
@@ -1417,13 +1590,13 @@
                 <w:b w:val="0"/>
                 <w:sz w:val="19"/>
               </w:rPr>
-              <w:t>45 min</w:t>
+              <w:t>40 min</w:t>
             </w:r>
           </w:p>
         </w:tc>
         <w:tc>
           <w:tcPr>
-            <w:tcW w:type="dxa" w:w="6840"/>
+            <w:tcW w:type="dxa" w:w="6552"/>
           </w:tcPr>
           <w:p>
             <w:r/>
@@ -1433,7 +1606,7 @@
                 <w:b w:val="0"/>
                 <w:sz w:val="19"/>
               </w:rPr>
-              <w:t>Hands-on: Lab 4: Analyse Pilot Readiness and Verify Copilot Formulas in Excel</w:t>
+              <w:t>Lab 4 (Repeatable reporting): Use and Improve the Skill in Excel and PowerPoint</w:t>
             </w:r>
           </w:p>
         </w:tc>
@@ -1444,7 +1617,25 @@
         </w:trPr>
         <w:tc>
           <w:tcPr>
-            <w:tcW w:type="dxa" w:w="1656"/>
+            <w:tcW w:type="dxa" w:w="1584"/>
+            <w:shd w:val="clear" w:color="auto" w:fill="E8F0FE"/>
+          </w:tcPr>
+          <w:p>
+            <w:r/>
+            <w:r>
+              <w:rPr>
+                <w:rFonts w:ascii="Arial" w:hAnsi="Arial"/>
+                <w:b/>
+                <w:sz w:val="19"/>
+              </w:rPr>
+              <w:t>14:10–14:20</w:t>
+            </w:r>
+          </w:p>
+        </w:tc>
+        <w:tc>
+          <w:tcPr>
+            <w:tcW w:type="dxa" w:w="1224"/>
+            <w:shd w:val="clear" w:color="auto" w:fill="E8F0FE"/>
           </w:tcPr>
           <w:p>
             <w:r/>
@@ -1454,39 +1645,24 @@
                 <w:b w:val="0"/>
                 <w:sz w:val="19"/>
               </w:rPr>
-              <w:t>15:25–16:00</w:t>
+              <w:t>10 min</w:t>
             </w:r>
           </w:p>
         </w:tc>
         <w:tc>
           <w:tcPr>
-            <w:tcW w:type="dxa" w:w="1296"/>
+            <w:tcW w:type="dxa" w:w="6552"/>
+            <w:shd w:val="clear" w:color="auto" w:fill="E8F0FE"/>
           </w:tcPr>
           <w:p>
             <w:r/>
             <w:r>
               <w:rPr>
                 <w:rFonts w:ascii="Arial" w:hAnsi="Arial"/>
-                <w:b w:val="0"/>
+                <w:b/>
                 <w:sz w:val="19"/>
               </w:rPr>
-              <w:t>35 min</w:t>
-            </w:r>
-          </w:p>
-        </w:tc>
-        <w:tc>
-          <w:tcPr>
-            <w:tcW w:type="dxa" w:w="6840"/>
-          </w:tcPr>
-          <w:p>
-            <w:r/>
-            <w:r>
-              <w:rPr>
-                <w:rFonts w:ascii="Arial" w:hAnsi="Arial"/>
-                <w:b w:val="0"/>
-                <w:sz w:val="19"/>
-              </w:rPr>
-              <w:t>Hands-on: Lab 5: Summarise the Launch Thread and Prepare a Reviewed Outlook Draft</w:t>
+              <w:t>Topic 3: concepts for Lab 5</w:t>
             </w:r>
           </w:p>
         </w:tc>
@@ -1497,7 +1673,60 @@
         </w:trPr>
         <w:tc>
           <w:tcPr>
-            <w:tcW w:type="dxa" w:w="1656"/>
+            <w:tcW w:type="dxa" w:w="1584"/>
+          </w:tcPr>
+          <w:p>
+            <w:r/>
+            <w:r>
+              <w:rPr>
+                <w:rFonts w:ascii="Arial" w:hAnsi="Arial"/>
+                <w:b w:val="0"/>
+                <w:sz w:val="19"/>
+              </w:rPr>
+              <w:t>14:20–15:10</w:t>
+            </w:r>
+          </w:p>
+        </w:tc>
+        <w:tc>
+          <w:tcPr>
+            <w:tcW w:type="dxa" w:w="1224"/>
+          </w:tcPr>
+          <w:p>
+            <w:r/>
+            <w:r>
+              <w:rPr>
+                <w:rFonts w:ascii="Arial" w:hAnsi="Arial"/>
+                <w:b w:val="0"/>
+                <w:sz w:val="19"/>
+              </w:rPr>
+              <w:t>50 min</w:t>
+            </w:r>
+          </w:p>
+        </w:tc>
+        <w:tc>
+          <w:tcPr>
+            <w:tcW w:type="dxa" w:w="6552"/>
+          </w:tcPr>
+          <w:p>
+            <w:r/>
+            <w:r>
+              <w:rPr>
+                <w:rFonts w:ascii="Arial" w:hAnsi="Arial"/>
+                <w:b w:val="0"/>
+                <w:sz w:val="19"/>
+              </w:rPr>
+              <w:t>Lab 5 (Design and build): Build Maintenance Dashboard Measures and Charts</w:t>
+            </w:r>
+          </w:p>
+        </w:tc>
+      </w:tr>
+      <w:tr>
+        <w:trPr>
+          <w:cantSplit/>
+        </w:trPr>
+        <w:tc>
+          <w:tcPr>
+            <w:tcW w:type="dxa" w:w="1584"/>
             <w:shd w:val="clear" w:color="auto" w:fill="FFF4E5"/>
           </w:tcPr>
           <w:p>
@@ -1508,13 +1737,13 @@
                 <w:b w:val="0"/>
                 <w:sz w:val="19"/>
               </w:rPr>
-              <w:t>16:00–16:15</w:t>
+              <w:t>15:10–15:25</w:t>
             </w:r>
           </w:p>
         </w:tc>
         <w:tc>
           <w:tcPr>
-            <w:tcW w:type="dxa" w:w="1296"/>
+            <w:tcW w:type="dxa" w:w="1224"/>
             <w:shd w:val="clear" w:color="auto" w:fill="FFF4E5"/>
           </w:tcPr>
           <w:p>
@@ -1531,7 +1760,7 @@
         </w:tc>
         <w:tc>
           <w:tcPr>
-            <w:tcW w:type="dxa" w:w="6840"/>
+            <w:tcW w:type="dxa" w:w="6552"/>
             <w:shd w:val="clear" w:color="auto" w:fill="FFF4E5"/>
           </w:tcPr>
           <w:p>
@@ -1553,7 +1782,25 @@
         </w:trPr>
         <w:tc>
           <w:tcPr>
-            <w:tcW w:type="dxa" w:w="1656"/>
+            <w:tcW w:type="dxa" w:w="1584"/>
+            <w:shd w:val="clear" w:color="auto" w:fill="E8F0FE"/>
+          </w:tcPr>
+          <w:p>
+            <w:r/>
+            <w:r>
+              <w:rPr>
+                <w:rFonts w:ascii="Arial" w:hAnsi="Arial"/>
+                <w:b/>
+                <w:sz w:val="19"/>
+              </w:rPr>
+              <w:t>15:25–15:35</w:t>
+            </w:r>
+          </w:p>
+        </w:tc>
+        <w:tc>
+          <w:tcPr>
+            <w:tcW w:type="dxa" w:w="1224"/>
+            <w:shd w:val="clear" w:color="auto" w:fill="E8F0FE"/>
           </w:tcPr>
           <w:p>
             <w:r/>
@@ -1563,39 +1810,24 @@
                 <w:b w:val="0"/>
                 <w:sz w:val="19"/>
               </w:rPr>
-              <w:t>16:15–16:50</w:t>
+              <w:t>10 min</w:t>
             </w:r>
           </w:p>
         </w:tc>
         <w:tc>
           <w:tcPr>
-            <w:tcW w:type="dxa" w:w="1296"/>
+            <w:tcW w:type="dxa" w:w="6552"/>
+            <w:shd w:val="clear" w:color="auto" w:fill="E8F0FE"/>
           </w:tcPr>
           <w:p>
             <w:r/>
             <w:r>
               <w:rPr>
                 <w:rFonts w:ascii="Arial" w:hAnsi="Arial"/>
-                <w:b w:val="0"/>
+                <w:b/>
                 <w:sz w:val="19"/>
               </w:rPr>
-              <w:t>35 min</w:t>
-            </w:r>
-          </w:p>
-        </w:tc>
-        <w:tc>
-          <w:tcPr>
-            <w:tcW w:type="dxa" w:w="6840"/>
-          </w:tcPr>
-          <w:p>
-            <w:r/>
-            <w:r>
-              <w:rPr>
-                <w:rFonts w:ascii="Arial" w:hAnsi="Arial"/>
-                <w:b w:val="0"/>
-                <w:sz w:val="19"/>
-              </w:rPr>
-              <w:t>Hands-on: Lab 6: Validate a Teams Recap and Create the Action Register</w:t>
+              <w:t>Topic 3: concepts for Lab 6</w:t>
             </w:r>
           </w:p>
         </w:tc>
@@ -1606,7 +1838,7 @@
         </w:trPr>
         <w:tc>
           <w:tcPr>
-            <w:tcW w:type="dxa" w:w="1656"/>
+            <w:tcW w:type="dxa" w:w="1584"/>
           </w:tcPr>
           <w:p>
             <w:r/>
@@ -1616,13 +1848,122 @@
                 <w:b w:val="0"/>
                 <w:sz w:val="19"/>
               </w:rPr>
-              <w:t>16:50–17:35</w:t>
+              <w:t>15:35–16:25</w:t>
             </w:r>
           </w:p>
         </w:tc>
         <w:tc>
           <w:tcPr>
-            <w:tcW w:type="dxa" w:w="1296"/>
+            <w:tcW w:type="dxa" w:w="1224"/>
+          </w:tcPr>
+          <w:p>
+            <w:r/>
+            <w:r>
+              <w:rPr>
+                <w:rFonts w:ascii="Arial" w:hAnsi="Arial"/>
+                <w:b w:val="0"/>
+                <w:sz w:val="19"/>
+              </w:rPr>
+              <w:t>50 min</w:t>
+            </w:r>
+          </w:p>
+        </w:tc>
+        <w:tc>
+          <w:tcPr>
+            <w:tcW w:type="dxa" w:w="6552"/>
+          </w:tcPr>
+          <w:p>
+            <w:r/>
+            <w:r>
+              <w:rPr>
+                <w:rFonts w:ascii="Arial" w:hAnsi="Arial"/>
+                <w:b w:val="0"/>
+                <w:sz w:val="19"/>
+              </w:rPr>
+              <w:t>Lab 6 (Filters and refresh): Make the Dashboard Interactive and Prove Refresh</w:t>
+            </w:r>
+          </w:p>
+        </w:tc>
+      </w:tr>
+      <w:tr>
+        <w:trPr>
+          <w:cantSplit/>
+        </w:trPr>
+        <w:tc>
+          <w:tcPr>
+            <w:tcW w:type="dxa" w:w="1584"/>
+            <w:shd w:val="clear" w:color="auto" w:fill="E8F0FE"/>
+          </w:tcPr>
+          <w:p>
+            <w:r/>
+            <w:r>
+              <w:rPr>
+                <w:rFonts w:ascii="Arial" w:hAnsi="Arial"/>
+                <w:b/>
+                <w:sz w:val="19"/>
+              </w:rPr>
+              <w:t>16:25–16:35</w:t>
+            </w:r>
+          </w:p>
+        </w:tc>
+        <w:tc>
+          <w:tcPr>
+            <w:tcW w:type="dxa" w:w="1224"/>
+            <w:shd w:val="clear" w:color="auto" w:fill="E8F0FE"/>
+          </w:tcPr>
+          <w:p>
+            <w:r/>
+            <w:r>
+              <w:rPr>
+                <w:rFonts w:ascii="Arial" w:hAnsi="Arial"/>
+                <w:b w:val="0"/>
+                <w:sz w:val="19"/>
+              </w:rPr>
+              <w:t>10 min</w:t>
+            </w:r>
+          </w:p>
+        </w:tc>
+        <w:tc>
+          <w:tcPr>
+            <w:tcW w:type="dxa" w:w="6552"/>
+            <w:shd w:val="clear" w:color="auto" w:fill="E8F0FE"/>
+          </w:tcPr>
+          <w:p>
+            <w:r/>
+            <w:r>
+              <w:rPr>
+                <w:rFonts w:ascii="Arial" w:hAnsi="Arial"/>
+                <w:b/>
+                <w:sz w:val="19"/>
+              </w:rPr>
+              <w:t>Topic 4: concepts for Lab 7</w:t>
+            </w:r>
+          </w:p>
+        </w:tc>
+      </w:tr>
+      <w:tr>
+        <w:trPr>
+          <w:cantSplit/>
+        </w:trPr>
+        <w:tc>
+          <w:tcPr>
+            <w:tcW w:type="dxa" w:w="1584"/>
+          </w:tcPr>
+          <w:p>
+            <w:r/>
+            <w:r>
+              <w:rPr>
+                <w:rFonts w:ascii="Arial" w:hAnsi="Arial"/>
+                <w:b w:val="0"/>
+                <w:sz w:val="19"/>
+              </w:rPr>
+              <w:t>16:35–17:20</w:t>
+            </w:r>
+          </w:p>
+        </w:tc>
+        <w:tc>
+          <w:tcPr>
+            <w:tcW w:type="dxa" w:w="1224"/>
           </w:tcPr>
           <w:p>
             <w:r/>
@@ -1638,7 +1979,7 @@
         </w:tc>
         <w:tc>
           <w:tcPr>
-            <w:tcW w:type="dxa" w:w="6840"/>
+            <w:tcW w:type="dxa" w:w="6552"/>
           </w:tcPr>
           <w:p>
             <w:r/>
@@ -1648,7 +1989,7 @@
                 <w:b w:val="0"/>
                 <w:sz w:val="19"/>
               </w:rPr>
-              <w:t>Hands-on: Lab 7: Assemble and Reconcile the Cross-App Coordination Pack</w:t>
+              <w:t>Lab 7 (Dashboard to presentation): Turn Dashboard Evidence into a Management Story</w:t>
             </w:r>
           </w:p>
         </w:tc>
@@ -1659,7 +2000,25 @@
         </w:trPr>
         <w:tc>
           <w:tcPr>
-            <w:tcW w:type="dxa" w:w="1656"/>
+            <w:tcW w:type="dxa" w:w="1584"/>
+            <w:shd w:val="clear" w:color="auto" w:fill="E8F0FE"/>
+          </w:tcPr>
+          <w:p>
+            <w:r/>
+            <w:r>
+              <w:rPr>
+                <w:rFonts w:ascii="Arial" w:hAnsi="Arial"/>
+                <w:b/>
+                <w:sz w:val="19"/>
+              </w:rPr>
+              <w:t>17:20–17:30</w:t>
+            </w:r>
+          </w:p>
+        </w:tc>
+        <w:tc>
+          <w:tcPr>
+            <w:tcW w:type="dxa" w:w="1224"/>
+            <w:shd w:val="clear" w:color="auto" w:fill="E8F0FE"/>
           </w:tcPr>
           <w:p>
             <w:r/>
@@ -1669,13 +2028,51 @@
                 <w:b w:val="0"/>
                 <w:sz w:val="19"/>
               </w:rPr>
-              <w:t>17:35–18:20</w:t>
+              <w:t>10 min</w:t>
             </w:r>
           </w:p>
         </w:tc>
         <w:tc>
           <w:tcPr>
-            <w:tcW w:type="dxa" w:w="1296"/>
+            <w:tcW w:type="dxa" w:w="6552"/>
+            <w:shd w:val="clear" w:color="auto" w:fill="E8F0FE"/>
+          </w:tcPr>
+          <w:p>
+            <w:r/>
+            <w:r>
+              <w:rPr>
+                <w:rFonts w:ascii="Arial" w:hAnsi="Arial"/>
+                <w:b/>
+                <w:sz w:val="19"/>
+              </w:rPr>
+              <w:t>Topic 4: concepts for Lab 8</w:t>
+            </w:r>
+          </w:p>
+        </w:tc>
+      </w:tr>
+      <w:tr>
+        <w:trPr>
+          <w:cantSplit/>
+        </w:trPr>
+        <w:tc>
+          <w:tcPr>
+            <w:tcW w:type="dxa" w:w="1584"/>
+          </w:tcPr>
+          <w:p>
+            <w:r/>
+            <w:r>
+              <w:rPr>
+                <w:rFonts w:ascii="Arial" w:hAnsi="Arial"/>
+                <w:b w:val="0"/>
+                <w:sz w:val="19"/>
+              </w:rPr>
+              <w:t>17:30–18:15</w:t>
+            </w:r>
+          </w:p>
+        </w:tc>
+        <w:tc>
+          <w:tcPr>
+            <w:tcW w:type="dxa" w:w="1224"/>
           </w:tcPr>
           <w:p>
             <w:r/>
@@ -1691,7 +2088,7 @@
         </w:tc>
         <w:tc>
           <w:tcPr>
-            <w:tcW w:type="dxa" w:w="6840"/>
+            <w:tcW w:type="dxa" w:w="6552"/>
           </w:tcPr>
           <w:p>
             <w:r/>
@@ -1701,7 +2098,7 @@
                 <w:b w:val="0"/>
                 <w:sz w:val="19"/>
               </w:rPr>
-              <w:t>Hands-on: Lab 8: Run the Responsible-Use and Privacy Release Gate</w:t>
+              <w:t>Lab 8 (Professional handoff): Refine and Present the Maintenance Decision Deck</w:t>
             </w:r>
           </w:p>
         </w:tc>
@@ -1712,7 +2109,7 @@
         </w:trPr>
         <w:tc>
           <w:tcPr>
-            <w:tcW w:type="dxa" w:w="1656"/>
+            <w:tcW w:type="dxa" w:w="1584"/>
             <w:shd w:val="clear" w:color="auto" w:fill="F3F5F8"/>
           </w:tcPr>
           <w:p>
@@ -1723,13 +2120,13 @@
                 <w:b w:val="0"/>
                 <w:sz w:val="19"/>
               </w:rPr>
-              <w:t>18:20–18:30</w:t>
+              <w:t>18:15–18:30</w:t>
             </w:r>
           </w:p>
         </w:tc>
         <w:tc>
           <w:tcPr>
-            <w:tcW w:type="dxa" w:w="1296"/>
+            <w:tcW w:type="dxa" w:w="1224"/>
             <w:shd w:val="clear" w:color="auto" w:fill="F3F5F8"/>
           </w:tcPr>
           <w:p>
@@ -1740,13 +2137,13 @@
                 <w:b w:val="0"/>
                 <w:sz w:val="19"/>
               </w:rPr>
-              <w:t>10 min</w:t>
+              <w:t>15 min</w:t>
             </w:r>
           </w:p>
         </w:tc>
         <w:tc>
           <w:tcPr>
-            <w:tcW w:type="dxa" w:w="6840"/>
+            <w:tcW w:type="dxa" w:w="6552"/>
             <w:shd w:val="clear" w:color="auto" w:fill="F3F5F8"/>
           </w:tcPr>
           <w:p>
@@ -1757,7 +2154,7 @@
                 <w:b w:val="0"/>
                 <w:sz w:val="19"/>
               </w:rPr>
-              <w:t>Topic recaps mapped to LO1-LO4, continuing-practice plan and questions</w:t>
+              <w:t>LO1-LO4 recap, evidence handoff and questions</w:t>
             </w:r>
           </w:p>
         </w:tc>
@@ -1786,12 +2183,13 @@
       <w:tblPr>
         <w:tblStyle w:val="TableGrid"/>
         <w:tblW w:type="auto" w:w="0"/>
+        <w:tblLayout w:type="fixed"/>
         <w:tblLook w:firstColumn="1" w:firstRow="1" w:lastColumn="0" w:lastRow="0" w:noHBand="0" w:noVBand="1" w:val="04A0"/>
       </w:tblPr>
       <w:tblGrid>
-        <w:gridCol w:w="2880"/>
-        <w:gridCol w:w="2880"/>
-        <w:gridCol w:w="2880"/>
+        <w:gridCol w:w="4896"/>
+        <w:gridCol w:w="1872"/>
+        <w:gridCol w:w="2592"/>
       </w:tblGrid>
       <w:tr>
         <w:trPr>
@@ -1800,7 +2198,7 @@
         </w:trPr>
         <w:tc>
           <w:tcPr>
-            <w:tcW w:type="dxa" w:w="2880"/>
+            <w:tcW w:type="dxa" w:w="4896"/>
             <w:shd w:val="clear" w:color="auto" w:fill="1F6FEB"/>
           </w:tcPr>
           <w:p>
@@ -1818,7 +2216,7 @@
         </w:tc>
         <w:tc>
           <w:tcPr>
-            <w:tcW w:type="dxa" w:w="2880"/>
+            <w:tcW w:type="dxa" w:w="1872"/>
             <w:shd w:val="clear" w:color="auto" w:fill="1F6FEB"/>
           </w:tcPr>
           <w:p>
@@ -1836,7 +2234,7 @@
         </w:tc>
         <w:tc>
           <w:tcPr>
-            <w:tcW w:type="dxa" w:w="2880"/>
+            <w:tcW w:type="dxa" w:w="2592"/>
             <w:shd w:val="clear" w:color="auto" w:fill="1F6FEB"/>
           </w:tcPr>
           <w:p>
@@ -1859,7 +2257,7 @@
         </w:trPr>
         <w:tc>
           <w:tcPr>
-            <w:tcW w:type="dxa" w:w="2880"/>
+            <w:tcW w:type="dxa" w:w="4896"/>
             <w:shd w:val="clear" w:color="auto" w:fill="E8F0FE"/>
           </w:tcPr>
           <w:p>
@@ -1870,13 +2268,13 @@
                 <w:b/>
                 <w:sz w:val="19"/>
               </w:rPr>
-              <w:t>Topic 01: Getting Started with Microsoft 365 Copilot</w:t>
+              <w:t>Topic 1: Fundamentals of Microsoft 365 Copilot</w:t>
             </w:r>
           </w:p>
         </w:tc>
         <w:tc>
           <w:tcPr>
-            <w:tcW w:type="dxa" w:w="2880"/>
+            <w:tcW w:type="dxa" w:w="1872"/>
             <w:shd w:val="clear" w:color="auto" w:fill="E8F0FE"/>
           </w:tcPr>
           <w:p>
@@ -1887,13 +2285,13 @@
                 <w:b w:val="0"/>
                 <w:sz w:val="19"/>
               </w:rPr>
-              <w:t>First half · 3 connected labs</w:t>
+              <w:t>2 of 8 labs (25%)</w:t>
             </w:r>
           </w:p>
         </w:tc>
         <w:tc>
           <w:tcPr>
-            <w:tcW w:type="dxa" w:w="2880"/>
+            <w:tcW w:type="dxa" w:w="2592"/>
           </w:tcPr>
           <w:p>
             <w:r/>
@@ -1903,7 +2301,7 @@
                 <w:b w:val="0"/>
                 <w:sz w:val="19"/>
               </w:rPr>
-              <w:t>Lab 1, Lab 2, Lab 3</w:t>
+              <w:t>Lab 1, Lab 2</w:t>
             </w:r>
           </w:p>
         </w:tc>
@@ -1914,7 +2312,7 @@
         </w:trPr>
         <w:tc>
           <w:tcPr>
-            <w:tcW w:type="dxa" w:w="2880"/>
+            <w:tcW w:type="dxa" w:w="4896"/>
             <w:shd w:val="clear" w:color="auto" w:fill="E8F0FE"/>
           </w:tcPr>
           <w:p>
@@ -1925,13 +2323,13 @@
                 <w:b/>
                 <w:sz w:val="19"/>
               </w:rPr>
-              <w:t>Topic 02: Copilot Across Your Everyday Work Apps</w:t>
+              <w:t>Topic 2: Create Skills for Microsoft 365 Copilot</w:t>
             </w:r>
           </w:p>
         </w:tc>
         <w:tc>
           <w:tcPr>
-            <w:tcW w:type="dxa" w:w="2880"/>
+            <w:tcW w:type="dxa" w:w="1872"/>
             <w:shd w:val="clear" w:color="auto" w:fill="E8F0FE"/>
           </w:tcPr>
           <w:p>
@@ -1942,13 +2340,13 @@
                 <w:b w:val="0"/>
                 <w:sz w:val="19"/>
               </w:rPr>
-              <w:t>Second half · 5 connected labs</w:t>
+              <w:t>2 of 8 labs (25%)</w:t>
             </w:r>
           </w:p>
         </w:tc>
         <w:tc>
           <w:tcPr>
-            <w:tcW w:type="dxa" w:w="2880"/>
+            <w:tcW w:type="dxa" w:w="2592"/>
           </w:tcPr>
           <w:p>
             <w:r/>
@@ -1958,7 +2356,117 @@
                 <w:b w:val="0"/>
                 <w:sz w:val="19"/>
               </w:rPr>
-              <w:t>Lab 4, Lab 5, Lab 6, Lab 7, Lab 8</w:t>
+              <w:t>Lab 3, Lab 4</w:t>
+            </w:r>
+          </w:p>
+        </w:tc>
+      </w:tr>
+      <w:tr>
+        <w:trPr>
+          <w:cantSplit/>
+        </w:trPr>
+        <w:tc>
+          <w:tcPr>
+            <w:tcW w:type="dxa" w:w="4896"/>
+            <w:shd w:val="clear" w:color="auto" w:fill="E8F0FE"/>
+          </w:tcPr>
+          <w:p>
+            <w:r/>
+            <w:r>
+              <w:rPr>
+                <w:rFonts w:ascii="Arial" w:hAnsi="Arial"/>
+                <w:b/>
+                <w:sz w:val="19"/>
+              </w:rPr>
+              <w:t>Topic 3: Create an Interactive Dashboard with Excel Copilot</w:t>
+            </w:r>
+          </w:p>
+        </w:tc>
+        <w:tc>
+          <w:tcPr>
+            <w:tcW w:type="dxa" w:w="1872"/>
+            <w:shd w:val="clear" w:color="auto" w:fill="E8F0FE"/>
+          </w:tcPr>
+          <w:p>
+            <w:r/>
+            <w:r>
+              <w:rPr>
+                <w:rFonts w:ascii="Arial" w:hAnsi="Arial"/>
+                <w:b w:val="0"/>
+                <w:sz w:val="19"/>
+              </w:rPr>
+              <w:t>2 of 8 labs (25%)</w:t>
+            </w:r>
+          </w:p>
+        </w:tc>
+        <w:tc>
+          <w:tcPr>
+            <w:tcW w:type="dxa" w:w="2592"/>
+          </w:tcPr>
+          <w:p>
+            <w:r/>
+            <w:r>
+              <w:rPr>
+                <w:rFonts w:ascii="Arial" w:hAnsi="Arial"/>
+                <w:b w:val="0"/>
+                <w:sz w:val="19"/>
+              </w:rPr>
+              <w:t>Lab 5, Lab 6</w:t>
+            </w:r>
+          </w:p>
+        </w:tc>
+      </w:tr>
+      <w:tr>
+        <w:trPr>
+          <w:cantSplit/>
+        </w:trPr>
+        <w:tc>
+          <w:tcPr>
+            <w:tcW w:type="dxa" w:w="4896"/>
+            <w:shd w:val="clear" w:color="auto" w:fill="E8F0FE"/>
+          </w:tcPr>
+          <w:p>
+            <w:r/>
+            <w:r>
+              <w:rPr>
+                <w:rFonts w:ascii="Arial" w:hAnsi="Arial"/>
+                <w:b/>
+                <w:sz w:val="19"/>
+              </w:rPr>
+              <w:t>Topic 4: Create a Professional Presentation with PowerPoint Copilot</w:t>
+            </w:r>
+          </w:p>
+        </w:tc>
+        <w:tc>
+          <w:tcPr>
+            <w:tcW w:type="dxa" w:w="1872"/>
+            <w:shd w:val="clear" w:color="auto" w:fill="E8F0FE"/>
+          </w:tcPr>
+          <w:p>
+            <w:r/>
+            <w:r>
+              <w:rPr>
+                <w:rFonts w:ascii="Arial" w:hAnsi="Arial"/>
+                <w:b w:val="0"/>
+                <w:sz w:val="19"/>
+              </w:rPr>
+              <w:t>2 of 8 labs (25%)</w:t>
+            </w:r>
+          </w:p>
+        </w:tc>
+        <w:tc>
+          <w:tcPr>
+            <w:tcW w:type="dxa" w:w="2592"/>
+          </w:tcPr>
+          <w:p>
+            <w:r/>
+            <w:r>
+              <w:rPr>
+                <w:rFonts w:ascii="Arial" w:hAnsi="Arial"/>
+                <w:b w:val="0"/>
+                <w:sz w:val="19"/>
+              </w:rPr>
+              <w:t>Lab 7, Lab 8</w:t>
             </w:r>
           </w:p>
         </w:tc>

</xml_diff>

<commit_message>
feat: expand C27 to ten labs with Pareto and dashboard skills
</commit_message>
<xml_diff>
--- a/courseware/LP-Microsoft 365 Copilot Masterclass.docx
+++ b/courseware/LP-Microsoft 365 Copilot Masterclass.docx
@@ -179,7 +179,7 @@
           <w:color w:val="1F6FEB"/>
           <w:sz w:val="24"/>
         </w:rPr>
-        <w:t>Version 2.1</w:t>
+        <w:t>Version 2.2</w:t>
       </w:r>
     </w:p>
     <w:p>
@@ -280,6 +280,64 @@
                 <w:sz w:val="19"/>
               </w:rPr>
               <w:t>Author</w:t>
+            </w:r>
+          </w:p>
+        </w:tc>
+      </w:tr>
+      <w:tr>
+        <w:tc>
+          <w:tcPr>
+            <w:tcW w:type="dxa" w:w="1152"/>
+          </w:tcPr>
+          <w:p>
+            <w:r/>
+            <w:r>
+              <w:rPr>
+                <w:sz w:val="19"/>
+              </w:rPr>
+              <w:t>2.2</w:t>
+            </w:r>
+          </w:p>
+        </w:tc>
+        <w:tc>
+          <w:tcPr>
+            <w:tcW w:type="dxa" w:w="1656"/>
+          </w:tcPr>
+          <w:p>
+            <w:r/>
+            <w:r>
+              <w:rPr>
+                <w:sz w:val="19"/>
+              </w:rPr>
+              <w:t>14 October 2026</w:t>
+            </w:r>
+          </w:p>
+        </w:tc>
+        <w:tc>
+          <w:tcPr>
+            <w:tcW w:type="dxa" w:w="4896"/>
+          </w:tcPr>
+          <w:p>
+            <w:r/>
+            <w:r>
+              <w:rPr>
+                <w:sz w:val="19"/>
+              </w:rPr>
+              <w:t>Ten connected labs: account Personalisation, visible .Rules, create/apply Pareto and reporting Skills, custom interactive-dashboard Skill, filters and controlled refresh.</w:t>
+            </w:r>
+          </w:p>
+        </w:tc>
+        <w:tc>
+          <w:tcPr>
+            <w:tcW w:type="dxa" w:w="1656"/>
+          </w:tcPr>
+          <w:p>
+            <w:r/>
+            <w:r>
+              <w:rPr>
+                <w:sz w:val="19"/>
+              </w:rPr>
+              <w:t>Tertiary Infotech Academy</w:t>
             </w:r>
           </w:p>
         </w:tc>
@@ -896,7 +954,7 @@
         <w:rPr>
           <w:sz w:val="21"/>
         </w:rPr>
-        <w:t>LO2: Create, install, apply and improve a custom maintenance-reporting skill in Excel and PowerPoint, preserving source records and testing reruns.</w:t>
+        <w:t>LO2: Distinguish account Personalisation, workbook .Rules and reusable Skills; configure, create, apply and verify Pareto and maintenance-reporting Skills using water-service evidence.</w:t>
       </w:r>
     </w:p>
     <w:p>
@@ -907,7 +965,7 @@
         <w:rPr>
           <w:sz w:val="21"/>
         </w:rPr>
-        <w:t>LO3: Create an interactive maintenance dashboard with verified measures, common filter scope, meaningful charts and a demonstrated refresh test.</w:t>
+        <w:t>LO3: Create and apply a custom interactive-dashboard Skill with verified measures, shared filter scope, editable charts and controlled refresh and rerun tests.</w:t>
       </w:r>
     </w:p>
     <w:p>
@@ -1082,7 +1140,7 @@
                 <w:b w:val="0"/>
                 <w:sz w:val="19"/>
               </w:rPr>
-              <w:t>09:30–09:45</w:t>
+              <w:t>09:30–09:40</w:t>
             </w:r>
           </w:p>
         </w:tc>
@@ -1099,7 +1157,7 @@
                 <w:b w:val="0"/>
                 <w:sz w:val="19"/>
               </w:rPr>
-              <w:t>15 min</w:t>
+              <w:t>10 min</w:t>
             </w:r>
           </w:p>
         </w:tc>
@@ -1138,7 +1196,7 @@
                 <w:b/>
                 <w:sz w:val="19"/>
               </w:rPr>
-              <w:t>09:45–09:55</w:t>
+              <w:t>09:40–09:50</w:t>
             </w:r>
           </w:p>
         </w:tc>
@@ -1172,7 +1230,7 @@
                 <w:b/>
                 <w:sz w:val="19"/>
               </w:rPr>
-              <w:t>Topic 1: concepts for Lab 1</w:t>
+              <w:t>Topic 1: concepts and demonstration</w:t>
             </w:r>
           </w:p>
         </w:tc>
@@ -1193,7 +1251,7 @@
                 <w:b w:val="0"/>
                 <w:sz w:val="19"/>
               </w:rPr>
-              <w:t>09:55–10:30</w:t>
+              <w:t>09:50–10:25</w:t>
             </w:r>
           </w:p>
         </w:tc>
@@ -1237,6 +1295,59 @@
         <w:tc>
           <w:tcPr>
             <w:tcW w:type="dxa" w:w="1584"/>
+          </w:tcPr>
+          <w:p>
+            <w:r/>
+            <w:r>
+              <w:rPr>
+                <w:rFonts w:ascii="Arial" w:hAnsi="Arial"/>
+                <w:b w:val="0"/>
+                <w:sz w:val="19"/>
+              </w:rPr>
+              <w:t>10:25–11:00</w:t>
+            </w:r>
+          </w:p>
+        </w:tc>
+        <w:tc>
+          <w:tcPr>
+            <w:tcW w:type="dxa" w:w="1224"/>
+          </w:tcPr>
+          <w:p>
+            <w:r/>
+            <w:r>
+              <w:rPr>
+                <w:rFonts w:ascii="Arial" w:hAnsi="Arial"/>
+                <w:b w:val="0"/>
+                <w:sz w:val="19"/>
+              </w:rPr>
+              <w:t>35 min</w:t>
+            </w:r>
+          </w:p>
+        </w:tc>
+        <w:tc>
+          <w:tcPr>
+            <w:tcW w:type="dxa" w:w="6552"/>
+          </w:tcPr>
+          <w:p>
+            <w:r/>
+            <w:r>
+              <w:rPr>
+                <w:rFonts w:ascii="Arial" w:hAnsi="Arial"/>
+                <w:b w:val="0"/>
+                <w:sz w:val="19"/>
+              </w:rPr>
+              <w:t>Lab 2 (Word to PowerPoint and Outlook): Create the Cross-App Maintenance Update</w:t>
+            </w:r>
+          </w:p>
+        </w:tc>
+      </w:tr>
+      <w:tr>
+        <w:trPr>
+          <w:cantSplit/>
+        </w:trPr>
+        <w:tc>
+          <w:tcPr>
+            <w:tcW w:type="dxa" w:w="1584"/>
             <w:shd w:val="clear" w:color="auto" w:fill="FFF4E5"/>
           </w:tcPr>
           <w:p>
@@ -1247,7 +1358,7 @@
                 <w:b w:val="0"/>
                 <w:sz w:val="19"/>
               </w:rPr>
-              <w:t>10:30–10:45</w:t>
+              <w:t>11:00–11:15</w:t>
             </w:r>
           </w:p>
         </w:tc>
@@ -1303,7 +1414,7 @@
                 <w:b/>
                 <w:sz w:val="19"/>
               </w:rPr>
-              <w:t>10:45–10:55</w:t>
+              <w:t>11:15–11:40</w:t>
             </w:r>
           </w:p>
         </w:tc>
@@ -1320,7 +1431,7 @@
                 <w:b w:val="0"/>
                 <w:sz w:val="19"/>
               </w:rPr>
-              <w:t>10 min</w:t>
+              <w:t>25 min</w:t>
             </w:r>
           </w:p>
         </w:tc>
@@ -1337,7 +1448,7 @@
                 <w:b/>
                 <w:sz w:val="19"/>
               </w:rPr>
-              <w:t>Topic 1: concepts for Lab 2</w:t>
+              <w:t>Topic 2: concepts and demonstration</w:t>
             </w:r>
           </w:p>
         </w:tc>
@@ -1358,7 +1469,60 @@
                 <w:b w:val="0"/>
                 <w:sz w:val="19"/>
               </w:rPr>
-              <w:t>10:55–11:30</w:t>
+              <w:t>11:40–12:05</w:t>
+            </w:r>
+          </w:p>
+        </w:tc>
+        <w:tc>
+          <w:tcPr>
+            <w:tcW w:type="dxa" w:w="1224"/>
+          </w:tcPr>
+          <w:p>
+            <w:r/>
+            <w:r>
+              <w:rPr>
+                <w:rFonts w:ascii="Arial" w:hAnsi="Arial"/>
+                <w:b w:val="0"/>
+                <w:sz w:val="19"/>
+              </w:rPr>
+              <w:t>25 min</w:t>
+            </w:r>
+          </w:p>
+        </w:tc>
+        <w:tc>
+          <w:tcPr>
+            <w:tcW w:type="dxa" w:w="6552"/>
+          </w:tcPr>
+          <w:p>
+            <w:r/>
+            <w:r>
+              <w:rPr>
+                <w:rFonts w:ascii="Arial" w:hAnsi="Arial"/>
+                <w:b w:val="0"/>
+                <w:sz w:val="19"/>
+              </w:rPr>
+              <w:t>Lab 3 (Personalisation): Personalise Copilot in Excel for Consistent Service Reports</w:t>
+            </w:r>
+          </w:p>
+        </w:tc>
+      </w:tr>
+      <w:tr>
+        <w:trPr>
+          <w:cantSplit/>
+        </w:trPr>
+        <w:tc>
+          <w:tcPr>
+            <w:tcW w:type="dxa" w:w="1584"/>
+          </w:tcPr>
+          <w:p>
+            <w:r/>
+            <w:r>
+              <w:rPr>
+                <w:rFonts w:ascii="Arial" w:hAnsi="Arial"/>
+                <w:b w:val="0"/>
+                <w:sz w:val="19"/>
+              </w:rPr>
+              <w:t>12:05–12:40</w:t>
             </w:r>
           </w:p>
         </w:tc>
@@ -1390,63 +1554,7 @@
                 <w:b w:val="0"/>
                 <w:sz w:val="19"/>
               </w:rPr>
-              <w:t>Lab 2 (Word to PowerPoint and Outlook): Create the Cross-App Maintenance Update</w:t>
-            </w:r>
-          </w:p>
-        </w:tc>
-      </w:tr>
-      <w:tr>
-        <w:trPr>
-          <w:cantSplit/>
-        </w:trPr>
-        <w:tc>
-          <w:tcPr>
-            <w:tcW w:type="dxa" w:w="1584"/>
-            <w:shd w:val="clear" w:color="auto" w:fill="E8F0FE"/>
-          </w:tcPr>
-          <w:p>
-            <w:r/>
-            <w:r>
-              <w:rPr>
-                <w:rFonts w:ascii="Arial" w:hAnsi="Arial"/>
-                <w:b/>
-                <w:sz w:val="19"/>
-              </w:rPr>
-              <w:t>11:30–11:40</w:t>
-            </w:r>
-          </w:p>
-        </w:tc>
-        <w:tc>
-          <w:tcPr>
-            <w:tcW w:type="dxa" w:w="1224"/>
-            <w:shd w:val="clear" w:color="auto" w:fill="E8F0FE"/>
-          </w:tcPr>
-          <w:p>
-            <w:r/>
-            <w:r>
-              <w:rPr>
-                <w:rFonts w:ascii="Arial" w:hAnsi="Arial"/>
-                <w:b w:val="0"/>
-                <w:sz w:val="19"/>
-              </w:rPr>
-              <w:t>10 min</w:t>
-            </w:r>
-          </w:p>
-        </w:tc>
-        <w:tc>
-          <w:tcPr>
-            <w:tcW w:type="dxa" w:w="6552"/>
-            <w:shd w:val="clear" w:color="auto" w:fill="E8F0FE"/>
-          </w:tcPr>
-          <w:p>
-            <w:r/>
-            <w:r>
-              <w:rPr>
-                <w:rFonts w:ascii="Arial" w:hAnsi="Arial"/>
-                <w:b/>
-                <w:sz w:val="19"/>
-              </w:rPr>
-              <w:t>Topic 2: concepts for Lab 3</w:t>
+              <w:t>Lab 4 (Workbook .Rules): Create and Test Workbook .Rules for Water Service Reporting</w:t>
             </w:r>
           </w:p>
         </w:tc>
@@ -1467,7 +1575,7 @@
                 <w:b w:val="0"/>
                 <w:sz w:val="19"/>
               </w:rPr>
-              <w:t>11:40–12:20</w:t>
+              <w:t>12:40–13:20</w:t>
             </w:r>
           </w:p>
         </w:tc>
@@ -1499,7 +1607,7 @@
                 <w:b w:val="0"/>
                 <w:sz w:val="19"/>
               </w:rPr>
-              <w:t>Lab 3 (Author SKILL.md): Create a Custom Maintenance Reporting Skill</w:t>
+              <w:t>Lab 5 (Custom Pareto Chart Skill): Create a Custom Pareto Chart Skill and Apply It</w:t>
             </w:r>
           </w:p>
         </w:tc>
@@ -1521,7 +1629,7 @@
                 <w:b w:val="0"/>
                 <w:sz w:val="19"/>
               </w:rPr>
-              <w:t>12:20–13:20</w:t>
+              <w:t>13:20–14:20</w:t>
             </w:r>
           </w:p>
         </w:tc>
@@ -1567,6 +1675,59 @@
         <w:tc>
           <w:tcPr>
             <w:tcW w:type="dxa" w:w="1584"/>
+          </w:tcPr>
+          <w:p>
+            <w:r/>
+            <w:r>
+              <w:rPr>
+                <w:rFonts w:ascii="Arial" w:hAnsi="Arial"/>
+                <w:b w:val="0"/>
+                <w:sz w:val="19"/>
+              </w:rPr>
+              <w:t>14:20–15:00</w:t>
+            </w:r>
+          </w:p>
+        </w:tc>
+        <w:tc>
+          <w:tcPr>
+            <w:tcW w:type="dxa" w:w="1224"/>
+          </w:tcPr>
+          <w:p>
+            <w:r/>
+            <w:r>
+              <w:rPr>
+                <w:rFonts w:ascii="Arial" w:hAnsi="Arial"/>
+                <w:b w:val="0"/>
+                <w:sz w:val="19"/>
+              </w:rPr>
+              <w:t>40 min</w:t>
+            </w:r>
+          </w:p>
+        </w:tc>
+        <w:tc>
+          <w:tcPr>
+            <w:tcW w:type="dxa" w:w="6552"/>
+          </w:tcPr>
+          <w:p>
+            <w:r/>
+            <w:r>
+              <w:rPr>
+                <w:rFonts w:ascii="Arial" w:hAnsi="Arial"/>
+                <w:b w:val="0"/>
+                <w:sz w:val="19"/>
+              </w:rPr>
+              <w:t>Lab 6 (Reporting Skill): Create, Use and Improve the Maintenance Reporting Skill</w:t>
+            </w:r>
+          </w:p>
+        </w:tc>
+      </w:tr>
+      <w:tr>
+        <w:trPr>
+          <w:cantSplit/>
+        </w:trPr>
+        <w:tc>
+          <w:tcPr>
+            <w:tcW w:type="dxa" w:w="1584"/>
             <w:shd w:val="clear" w:color="auto" w:fill="E8F0FE"/>
           </w:tcPr>
           <w:p>
@@ -1577,7 +1738,7 @@
                 <w:b/>
                 <w:sz w:val="19"/>
               </w:rPr>
-              <w:t>13:20–13:30</w:t>
+              <w:t>15:00–15:10</w:t>
             </w:r>
           </w:p>
         </w:tc>
@@ -1611,7 +1772,7 @@
                 <w:b/>
                 <w:sz w:val="19"/>
               </w:rPr>
-              <w:t>Topic 2: concepts for Lab 4</w:t>
+              <w:t>Topic 3: concepts and demonstration</w:t>
             </w:r>
           </w:p>
         </w:tc>
@@ -1632,7 +1793,7 @@
                 <w:b w:val="0"/>
                 <w:sz w:val="19"/>
               </w:rPr>
-              <w:t>13:30–14:10</w:t>
+              <w:t>15:10–15:55</w:t>
             </w:r>
           </w:p>
         </w:tc>
@@ -1648,7 +1809,7 @@
                 <w:b w:val="0"/>
                 <w:sz w:val="19"/>
               </w:rPr>
-              <w:t>40 min</w:t>
+              <w:t>45 min</w:t>
             </w:r>
           </w:p>
         </w:tc>
@@ -1664,116 +1825,7 @@
                 <w:b w:val="0"/>
                 <w:sz w:val="19"/>
               </w:rPr>
-              <w:t>Lab 4 (Repeatable reporting): Use and Improve the Skill in Excel and PowerPoint</w:t>
-            </w:r>
-          </w:p>
-        </w:tc>
-      </w:tr>
-      <w:tr>
-        <w:trPr>
-          <w:cantSplit/>
-        </w:trPr>
-        <w:tc>
-          <w:tcPr>
-            <w:tcW w:type="dxa" w:w="1584"/>
-            <w:shd w:val="clear" w:color="auto" w:fill="E8F0FE"/>
-          </w:tcPr>
-          <w:p>
-            <w:r/>
-            <w:r>
-              <w:rPr>
-                <w:rFonts w:ascii="Arial" w:hAnsi="Arial"/>
-                <w:b/>
-                <w:sz w:val="19"/>
-              </w:rPr>
-              <w:t>14:10–14:20</w:t>
-            </w:r>
-          </w:p>
-        </w:tc>
-        <w:tc>
-          <w:tcPr>
-            <w:tcW w:type="dxa" w:w="1224"/>
-            <w:shd w:val="clear" w:color="auto" w:fill="E8F0FE"/>
-          </w:tcPr>
-          <w:p>
-            <w:r/>
-            <w:r>
-              <w:rPr>
-                <w:rFonts w:ascii="Arial" w:hAnsi="Arial"/>
-                <w:b w:val="0"/>
-                <w:sz w:val="19"/>
-              </w:rPr>
-              <w:t>10 min</w:t>
-            </w:r>
-          </w:p>
-        </w:tc>
-        <w:tc>
-          <w:tcPr>
-            <w:tcW w:type="dxa" w:w="6552"/>
-            <w:shd w:val="clear" w:color="auto" w:fill="E8F0FE"/>
-          </w:tcPr>
-          <w:p>
-            <w:r/>
-            <w:r>
-              <w:rPr>
-                <w:rFonts w:ascii="Arial" w:hAnsi="Arial"/>
-                <w:b/>
-                <w:sz w:val="19"/>
-              </w:rPr>
-              <w:t>Topic 3: concepts for Lab 5</w:t>
-            </w:r>
-          </w:p>
-        </w:tc>
-      </w:tr>
-      <w:tr>
-        <w:trPr>
-          <w:cantSplit/>
-        </w:trPr>
-        <w:tc>
-          <w:tcPr>
-            <w:tcW w:type="dxa" w:w="1584"/>
-          </w:tcPr>
-          <w:p>
-            <w:r/>
-            <w:r>
-              <w:rPr>
-                <w:rFonts w:ascii="Arial" w:hAnsi="Arial"/>
-                <w:b w:val="0"/>
-                <w:sz w:val="19"/>
-              </w:rPr>
-              <w:t>14:20–15:10</w:t>
-            </w:r>
-          </w:p>
-        </w:tc>
-        <w:tc>
-          <w:tcPr>
-            <w:tcW w:type="dxa" w:w="1224"/>
-          </w:tcPr>
-          <w:p>
-            <w:r/>
-            <w:r>
-              <w:rPr>
-                <w:rFonts w:ascii="Arial" w:hAnsi="Arial"/>
-                <w:b w:val="0"/>
-                <w:sz w:val="19"/>
-              </w:rPr>
-              <w:t>50 min</w:t>
-            </w:r>
-          </w:p>
-        </w:tc>
-        <w:tc>
-          <w:tcPr>
-            <w:tcW w:type="dxa" w:w="6552"/>
-          </w:tcPr>
-          <w:p>
-            <w:r/>
-            <w:r>
-              <w:rPr>
-                <w:rFonts w:ascii="Arial" w:hAnsi="Arial"/>
-                <w:b w:val="0"/>
-                <w:sz w:val="19"/>
-              </w:rPr>
-              <w:t>Lab 5 (Design and build): Build Maintenance Dashboard Measures and Charts</w:t>
+              <w:t>Lab 7 (Custom Dashboard Skill): Create and Apply a Custom Interactive Dashboard Skill</w:t>
             </w:r>
           </w:p>
         </w:tc>
@@ -1795,7 +1847,7 @@
                 <w:b w:val="0"/>
                 <w:sz w:val="19"/>
               </w:rPr>
-              <w:t>15:10–15:25</w:t>
+              <w:t>15:55–16:10</w:t>
             </w:r>
           </w:p>
         </w:tc>
@@ -1841,24 +1893,6 @@
         <w:tc>
           <w:tcPr>
             <w:tcW w:type="dxa" w:w="1584"/>
-            <w:shd w:val="clear" w:color="auto" w:fill="E8F0FE"/>
-          </w:tcPr>
-          <w:p>
-            <w:r/>
-            <w:r>
-              <w:rPr>
-                <w:rFonts w:ascii="Arial" w:hAnsi="Arial"/>
-                <w:b/>
-                <w:sz w:val="19"/>
-              </w:rPr>
-              <w:t>15:25–15:35</w:t>
-            </w:r>
-          </w:p>
-        </w:tc>
-        <w:tc>
-          <w:tcPr>
-            <w:tcW w:type="dxa" w:w="1224"/>
-            <w:shd w:val="clear" w:color="auto" w:fill="E8F0FE"/>
           </w:tcPr>
           <w:p>
             <w:r/>
@@ -1868,154 +1902,7 @@
                 <w:b w:val="0"/>
                 <w:sz w:val="19"/>
               </w:rPr>
-              <w:t>10 min</w:t>
-            </w:r>
-          </w:p>
-        </w:tc>
-        <w:tc>
-          <w:tcPr>
-            <w:tcW w:type="dxa" w:w="6552"/>
-            <w:shd w:val="clear" w:color="auto" w:fill="E8F0FE"/>
-          </w:tcPr>
-          <w:p>
-            <w:r/>
-            <w:r>
-              <w:rPr>
-                <w:rFonts w:ascii="Arial" w:hAnsi="Arial"/>
-                <w:b/>
-                <w:sz w:val="19"/>
-              </w:rPr>
-              <w:t>Topic 3: concepts for Lab 6</w:t>
-            </w:r>
-          </w:p>
-        </w:tc>
-      </w:tr>
-      <w:tr>
-        <w:trPr>
-          <w:cantSplit/>
-        </w:trPr>
-        <w:tc>
-          <w:tcPr>
-            <w:tcW w:type="dxa" w:w="1584"/>
-          </w:tcPr>
-          <w:p>
-            <w:r/>
-            <w:r>
-              <w:rPr>
-                <w:rFonts w:ascii="Arial" w:hAnsi="Arial"/>
-                <w:b w:val="0"/>
-                <w:sz w:val="19"/>
-              </w:rPr>
-              <w:t>15:35–16:25</w:t>
-            </w:r>
-          </w:p>
-        </w:tc>
-        <w:tc>
-          <w:tcPr>
-            <w:tcW w:type="dxa" w:w="1224"/>
-          </w:tcPr>
-          <w:p>
-            <w:r/>
-            <w:r>
-              <w:rPr>
-                <w:rFonts w:ascii="Arial" w:hAnsi="Arial"/>
-                <w:b w:val="0"/>
-                <w:sz w:val="19"/>
-              </w:rPr>
-              <w:t>50 min</w:t>
-            </w:r>
-          </w:p>
-        </w:tc>
-        <w:tc>
-          <w:tcPr>
-            <w:tcW w:type="dxa" w:w="6552"/>
-          </w:tcPr>
-          <w:p>
-            <w:r/>
-            <w:r>
-              <w:rPr>
-                <w:rFonts w:ascii="Arial" w:hAnsi="Arial"/>
-                <w:b w:val="0"/>
-                <w:sz w:val="19"/>
-              </w:rPr>
-              <w:t>Lab 6 (Filters and refresh): Make the Dashboard Interactive and Prove Refresh</w:t>
-            </w:r>
-          </w:p>
-        </w:tc>
-      </w:tr>
-      <w:tr>
-        <w:trPr>
-          <w:cantSplit/>
-        </w:trPr>
-        <w:tc>
-          <w:tcPr>
-            <w:tcW w:type="dxa" w:w="1584"/>
-            <w:shd w:val="clear" w:color="auto" w:fill="E8F0FE"/>
-          </w:tcPr>
-          <w:p>
-            <w:r/>
-            <w:r>
-              <w:rPr>
-                <w:rFonts w:ascii="Arial" w:hAnsi="Arial"/>
-                <w:b/>
-                <w:sz w:val="19"/>
-              </w:rPr>
-              <w:t>16:25–16:35</w:t>
-            </w:r>
-          </w:p>
-        </w:tc>
-        <w:tc>
-          <w:tcPr>
-            <w:tcW w:type="dxa" w:w="1224"/>
-            <w:shd w:val="clear" w:color="auto" w:fill="E8F0FE"/>
-          </w:tcPr>
-          <w:p>
-            <w:r/>
-            <w:r>
-              <w:rPr>
-                <w:rFonts w:ascii="Arial" w:hAnsi="Arial"/>
-                <w:b w:val="0"/>
-                <w:sz w:val="19"/>
-              </w:rPr>
-              <w:t>10 min</w:t>
-            </w:r>
-          </w:p>
-        </w:tc>
-        <w:tc>
-          <w:tcPr>
-            <w:tcW w:type="dxa" w:w="6552"/>
-            <w:shd w:val="clear" w:color="auto" w:fill="E8F0FE"/>
-          </w:tcPr>
-          <w:p>
-            <w:r/>
-            <w:r>
-              <w:rPr>
-                <w:rFonts w:ascii="Arial" w:hAnsi="Arial"/>
-                <w:b/>
-                <w:sz w:val="19"/>
-              </w:rPr>
-              <w:t>Topic 4: concepts for Lab 7</w:t>
-            </w:r>
-          </w:p>
-        </w:tc>
-      </w:tr>
-      <w:tr>
-        <w:trPr>
-          <w:cantSplit/>
-        </w:trPr>
-        <w:tc>
-          <w:tcPr>
-            <w:tcW w:type="dxa" w:w="1584"/>
-          </w:tcPr>
-          <w:p>
-            <w:r/>
-            <w:r>
-              <w:rPr>
-                <w:rFonts w:ascii="Arial" w:hAnsi="Arial"/>
-                <w:b w:val="0"/>
-                <w:sz w:val="19"/>
-              </w:rPr>
-              <w:t>16:35–17:20</w:t>
+              <w:t>16:10–16:55</w:t>
             </w:r>
           </w:p>
         </w:tc>
@@ -2047,7 +1934,7 @@
                 <w:b w:val="0"/>
                 <w:sz w:val="19"/>
               </w:rPr>
-              <w:t>Lab 7 (Dashboard to presentation): Turn Dashboard Evidence into a Management Story</w:t>
+              <w:t>Lab 8 (Interactive Filters and Refresh): Use the Dashboard Skill for Filters, Refresh and Safe Reruns</w:t>
             </w:r>
           </w:p>
         </w:tc>
@@ -2069,7 +1956,7 @@
                 <w:b/>
                 <w:sz w:val="19"/>
               </w:rPr>
-              <w:t>17:20–17:30</w:t>
+              <w:t>16:55–17:00</w:t>
             </w:r>
           </w:p>
         </w:tc>
@@ -2086,7 +1973,7 @@
                 <w:b w:val="0"/>
                 <w:sz w:val="19"/>
               </w:rPr>
-              <w:t>10 min</w:t>
+              <w:t>5 min</w:t>
             </w:r>
           </w:p>
         </w:tc>
@@ -2103,7 +1990,7 @@
                 <w:b/>
                 <w:sz w:val="19"/>
               </w:rPr>
-              <w:t>Topic 4: concepts for Lab 8</w:t>
+              <w:t>Topic 4: concepts and demonstration</w:t>
             </w:r>
           </w:p>
         </w:tc>
@@ -2124,7 +2011,7 @@
                 <w:b w:val="0"/>
                 <w:sz w:val="19"/>
               </w:rPr>
-              <w:t>17:30–18:15</w:t>
+              <w:t>17:00–17:40</w:t>
             </w:r>
           </w:p>
         </w:tc>
@@ -2140,7 +2027,7 @@
                 <w:b w:val="0"/>
                 <w:sz w:val="19"/>
               </w:rPr>
-              <w:t>45 min</w:t>
+              <w:t>40 min</w:t>
             </w:r>
           </w:p>
         </w:tc>
@@ -2156,7 +2043,60 @@
                 <w:b w:val="0"/>
                 <w:sz w:val="19"/>
               </w:rPr>
-              <w:t>Lab 8 (Professional handoff): Refine and Present the Maintenance Decision Deck</w:t>
+              <w:t>Lab 9 (Dashboard to presentation): Turn Dashboard Evidence into a Management Story</w:t>
+            </w:r>
+          </w:p>
+        </w:tc>
+      </w:tr>
+      <w:tr>
+        <w:trPr>
+          <w:cantSplit/>
+        </w:trPr>
+        <w:tc>
+          <w:tcPr>
+            <w:tcW w:type="dxa" w:w="1584"/>
+          </w:tcPr>
+          <w:p>
+            <w:r/>
+            <w:r>
+              <w:rPr>
+                <w:rFonts w:ascii="Arial" w:hAnsi="Arial"/>
+                <w:b w:val="0"/>
+                <w:sz w:val="19"/>
+              </w:rPr>
+              <w:t>17:40–18:20</w:t>
+            </w:r>
+          </w:p>
+        </w:tc>
+        <w:tc>
+          <w:tcPr>
+            <w:tcW w:type="dxa" w:w="1224"/>
+          </w:tcPr>
+          <w:p>
+            <w:r/>
+            <w:r>
+              <w:rPr>
+                <w:rFonts w:ascii="Arial" w:hAnsi="Arial"/>
+                <w:b w:val="0"/>
+                <w:sz w:val="19"/>
+              </w:rPr>
+              <w:t>40 min</w:t>
+            </w:r>
+          </w:p>
+        </w:tc>
+        <w:tc>
+          <w:tcPr>
+            <w:tcW w:type="dxa" w:w="6552"/>
+          </w:tcPr>
+          <w:p>
+            <w:r/>
+            <w:r>
+              <w:rPr>
+                <w:rFonts w:ascii="Arial" w:hAnsi="Arial"/>
+                <w:b w:val="0"/>
+                <w:sz w:val="19"/>
+              </w:rPr>
+              <w:t>Lab 10 (Professional handoff): Refine and Present the Maintenance Decision Deck</w:t>
             </w:r>
           </w:p>
         </w:tc>
@@ -2178,7 +2118,7 @@
                 <w:b w:val="0"/>
                 <w:sz w:val="19"/>
               </w:rPr>
-              <w:t>18:15–18:30</w:t>
+              <w:t>18:20–18:30</w:t>
             </w:r>
           </w:p>
         </w:tc>
@@ -2195,7 +2135,7 @@
                 <w:b w:val="0"/>
                 <w:sz w:val="19"/>
               </w:rPr>
-              <w:t>15 min</w:t>
+              <w:t>10 min</w:t>
             </w:r>
           </w:p>
         </w:tc>
@@ -2343,7 +2283,7 @@
                 <w:b w:val="0"/>
                 <w:sz w:val="19"/>
               </w:rPr>
-              <w:t>2 of 8 labs (25%)</w:t>
+              <w:t>2 of 10 labs (20%)</w:t>
             </w:r>
           </w:p>
         </w:tc>
@@ -2381,7 +2321,7 @@
                 <w:b/>
                 <w:sz w:val="19"/>
               </w:rPr>
-              <w:t>Topic 2: Create Skills for Microsoft 365 Copilot</w:t>
+              <w:t>Topic 2: Personalisation, .Rules and Skills for Excel</w:t>
             </w:r>
           </w:p>
         </w:tc>
@@ -2398,7 +2338,7 @@
                 <w:b w:val="0"/>
                 <w:sz w:val="19"/>
               </w:rPr>
-              <w:t>2 of 8 labs (25%)</w:t>
+              <w:t>4 of 10 labs (40%)</w:t>
             </w:r>
           </w:p>
         </w:tc>
@@ -2414,7 +2354,7 @@
                 <w:b w:val="0"/>
                 <w:sz w:val="19"/>
               </w:rPr>
-              <w:t>Lab 3, Lab 4</w:t>
+              <w:t>Lab 3, Lab 4, Lab 5, Lab 6</w:t>
             </w:r>
           </w:p>
         </w:tc>
@@ -2436,7 +2376,7 @@
                 <w:b/>
                 <w:sz w:val="19"/>
               </w:rPr>
-              <w:t>Topic 3: Create an Interactive Dashboard with Excel Copilot</w:t>
+              <w:t>Topic 3: Interactive Dashboards with Custom Skills</w:t>
             </w:r>
           </w:p>
         </w:tc>
@@ -2453,7 +2393,7 @@
                 <w:b w:val="0"/>
                 <w:sz w:val="19"/>
               </w:rPr>
-              <w:t>2 of 8 labs (25%)</w:t>
+              <w:t>2 of 10 labs (20%)</w:t>
             </w:r>
           </w:p>
         </w:tc>
@@ -2469,7 +2409,7 @@
                 <w:b w:val="0"/>
                 <w:sz w:val="19"/>
               </w:rPr>
-              <w:t>Lab 5, Lab 6</w:t>
+              <w:t>Lab 7, Lab 8</w:t>
             </w:r>
           </w:p>
         </w:tc>
@@ -2508,7 +2448,7 @@
                 <w:b w:val="0"/>
                 <w:sz w:val="19"/>
               </w:rPr>
-              <w:t>2 of 8 labs (25%)</w:t>
+              <w:t>2 of 10 labs (20%)</w:t>
             </w:r>
           </w:p>
         </w:tc>
@@ -2524,7 +2464,7 @@
                 <w:b w:val="0"/>
                 <w:sz w:val="19"/>
               </w:rPr>
-              <w:t>Lab 7, Lab 8</w:t>
+              <w:t>Lab 9, Lab 10</w:t>
             </w:r>
           </w:p>
         </w:tc>

</xml_diff>